<commit_message>
Drop the placeholder from the stand's attendee list
Co-Authored-By: Claude Opus 5 <noreply@anthropic.com>
Claude-Session: https://claude.ai/code/session_01Sjbxhiyqm4RHxYEdj2ARcD
</commit_message>
<xml_diff>
--- a/2026-wetenschapsdag-CWI-scientific-computing.docx
+++ b/2026-wetenschapsdag-CWI-scientific-computing.docx
@@ -406,24 +406,6 @@
                 <w:lang w:val="nl-NL"/>
               </w:rPr>
               <w:t>Syver Døving Agdestein (syver.agdestein@cwi.nl)</w:t>
-            </w:r>
-          </w:p>
-          <w:p>
-            <w:pPr>
-              <w:pStyle w:val="ListParagraph"/>
-              <w:numPr>
-                <w:ilvl w:val="0"/>
-                <w:numId w:val="2"/>
-              </w:numPr>
-              <w:rPr>
-                <w:lang w:val="nl-NL"/>
-              </w:rPr>
-            </w:pPr>
-            <w:r>
-              <w:rPr>
-                <w:lang w:val="nl-NL"/>
-              </w:rPr>
-              <w:t>[nog aan te vullen]</w:t>
             </w:r>
           </w:p>
         </w:tc>

</xml_diff>